<commit_message>
Completed model files for contract
</commit_message>
<xml_diff>
--- a/contract_files/models/Contrato Compra e Venda de Imovel com Matricula.docx
+++ b/contract_files/models/Contrato Compra e Venda de Imovel com Matricula.docx
@@ -95,7 +95,32 @@
           <w:szCs w:val="22"/>
           <w:lang w:val="pt-BR"/>
         </w:rPr>
-        <w:t xml:space="preserve">ade: __________________________, estado civil: __________________________, profissão: ___________________, inscrito(a) no CPF sob o nº: ________________________, portador(a) do RG nº: ____________________, residente e domiciliado(a) em   __________________</w:t>
+        <w:t xml:space="preserve">ade: __________________________, estado civil: _____________________________, </w:t>
+      </w:r>
+      <w:r>
+        <w:rPr>
+          <w:sz w:val="22"/>
+          <w:szCs w:val="22"/>
+          <w:lang w:val="pt-BR"/>
+        </w:rPr>
+        <w:t xml:space="preserve">regime de bens: ________________________,</w:t>
+      </w:r>
+      <w:r>
+        <w:rPr>
+          <w:sz w:val="22"/>
+          <w:szCs w:val="22"/>
+          <w:lang w:val="pt-BR"/>
+        </w:rPr>
+        <w:t xml:space="preserve"> </w:t>
+      </w:r>
+      <w:r/>
+      <w:r>
+        <w:rPr>
+          <w:sz w:val="22"/>
+          <w:szCs w:val="22"/>
+          <w:lang w:val="pt-BR"/>
+        </w:rPr>
+        <w:t xml:space="preserve"> profissão: ___________________, inscrito(a) no CPF sob o nº: ________________________, portador(a) do RG nº: ____________________, residente e domiciliado(a) em   __________________</w:t>
       </w:r>
       <w:r>
         <w:rPr>
@@ -116,6 +141,7 @@
         <w:rPr>
           <w:sz w:val="22"/>
           <w:szCs w:val="22"/>
+          <w:highlight w:val="none"/>
           <w:lang w:val="pt-BR"/>
         </w:rPr>
       </w:r>
@@ -129,6 +155,142 @@
         <w:rPr>
           <w:sz w:val="22"/>
           <w:szCs w:val="22"/>
+          <w:highlight w:val="none"/>
+          <w:lang w:val="pt-BR"/>
+        </w:rPr>
+      </w:pPr>
+      <w:r>
+        <w:rPr>
+          <w:sz w:val="22"/>
+          <w:szCs w:val="22"/>
+          <w:lang w:val="pt-BR"/>
+        </w:rPr>
+      </w:r>
+      <w:r>
+        <w:rPr>
+          <w:b/>
+          <w:bCs/>
+          <w:sz w:val="22"/>
+          <w:szCs w:val="22"/>
+          <w:lang w:val="pt-BR"/>
+        </w:rPr>
+        <w:t xml:space="preserve">CÔNJUGE ANUENTE DO(A) VENDEDOR(A)</w:t>
+      </w:r>
+      <w:r>
+        <w:rPr>
+          <w:sz w:val="28"/>
+          <w:szCs w:val="28"/>
+          <w:highlight w:val="none"/>
+          <w:lang w:val="pt-BR"/>
+        </w:rPr>
+        <w:t xml:space="preserve">:</w:t>
+      </w:r>
+      <w:r>
+        <w:rPr>
+          <w:sz w:val="22"/>
+          <w:szCs w:val="22"/>
+          <w:highlight w:val="none"/>
+          <w:lang w:val="pt-BR"/>
+        </w:rPr>
+      </w:r>
+      <w:r/>
+    </w:p>
+    <w:p>
+      <w:pPr>
+        <w:pBdr/>
+        <w:spacing w:line="276" w:lineRule="auto"/>
+        <w:ind w:left="-5"/>
+        <w:jc w:val="left"/>
+        <w:rPr>
+          <w:sz w:val="28"/>
+          <w:szCs w:val="28"/>
+          <w:lang w:val="pt-BR"/>
+        </w:rPr>
+      </w:pPr>
+      <w:r>
+        <w:rPr>
+          <w:sz w:val="28"/>
+          <w:szCs w:val="28"/>
+          <w:highlight w:val="none"/>
+          <w:lang w:val="pt-BR" w:bidi="pt-BR"/>
+        </w:rPr>
+      </w:r>
+      <w:r>
+        <w:rPr>
+          <w:sz w:val="22"/>
+          <w:szCs w:val="22"/>
+          <w:lang w:val="pt-BR"/>
+        </w:rPr>
+        <w:t xml:space="preserve">NOME COMPLETO: _____________________________________________________________, nacionalid</w:t>
+      </w:r>
+      <w:r>
+        <w:rPr>
+          <w:sz w:val="22"/>
+          <w:szCs w:val="22"/>
+          <w:lang w:val="pt-BR"/>
+        </w:rPr>
+        <w:t xml:space="preserve">ade: __________________________, estado civil: _____________________________,</w:t>
+      </w:r>
+      <w:r>
+        <w:rPr>
+          <w:sz w:val="22"/>
+          <w:szCs w:val="22"/>
+          <w:lang w:val="pt-BR"/>
+        </w:rPr>
+        <w:t xml:space="preserve"> </w:t>
+      </w:r>
+      <w:r>
+        <w:rPr>
+          <w:sz w:val="22"/>
+          <w:szCs w:val="22"/>
+          <w:lang w:val="pt-BR"/>
+        </w:rPr>
+        <w:t xml:space="preserve"> profissão: ___________________, inscrito(a) no CPF sob o nº: ________________________, portador(a) do RG nº: ____________________, residente e domiciliado(a) em   __________________</w:t>
+      </w:r>
+      <w:r>
+        <w:rPr>
+          <w:sz w:val="22"/>
+          <w:szCs w:val="22"/>
+          <w:lang w:val="pt-BR"/>
+        </w:rPr>
+        <w:t xml:space="preserve">____________________________________________________________ Município: ____________________, Estado: ____________________.</w:t>
+      </w:r>
+      <w:r/>
+      <w:r>
+        <w:rPr>
+          <w:sz w:val="28"/>
+          <w:szCs w:val="28"/>
+          <w:highlight w:val="none"/>
+          <w:lang w:val="pt-BR" w:bidi="pt-BR"/>
+        </w:rPr>
+      </w:r>
+      <w:r>
+        <w:rPr>
+          <w:sz w:val="28"/>
+          <w:szCs w:val="28"/>
+          <w:highlight w:val="none"/>
+          <w:lang w:val="pt-BR" w:bidi="pt-BR"/>
+        </w:rPr>
+      </w:r>
+      <w:r>
+        <w:rPr>
+          <w:sz w:val="28"/>
+          <w:szCs w:val="28"/>
+          <w:highlight w:val="none"/>
+          <w:lang w:val="pt-BR"/>
+        </w:rPr>
+      </w:r>
+    </w:p>
+    <w:p>
+      <w:pPr>
+        <w:pBdr/>
+        <w:spacing w:line="276" w:lineRule="auto"/>
+        <w:ind w:left="-5"/>
+        <w:jc w:val="left"/>
+        <w:rPr>
+          <w:sz w:val="22"/>
+          <w:szCs w:val="22"/>
+          <w:highlight w:val="none"/>
           <w:lang w:val="pt-BR"/>
         </w:rPr>
       </w:pPr>
@@ -157,7 +319,22 @@
           <w:lang w:val="pt-BR"/>
         </w:rPr>
         <w:br/>
-        <w:t xml:space="preserve">NOME COMPLETO: _____________________________________________________________, nacionalidade: __________________________, estado civil: __________________________, profissão: ___________________, inscrito(a) no CPF sob o nº: _______________________</w:t>
+        <w:t xml:space="preserve">NOME COMPLETO: _____________________________________________________________, nacionalidade: __________________________, estado civil: __________________________, </w:t>
+      </w:r>
+      <w:r>
+        <w:rPr>
+          <w:sz w:val="22"/>
+          <w:szCs w:val="22"/>
+          <w:lang w:val="pt-BR"/>
+        </w:rPr>
+      </w:r>
+      <w:r>
+        <w:rPr>
+          <w:sz w:val="22"/>
+          <w:szCs w:val="22"/>
+          <w:lang w:val="pt-BR"/>
+        </w:rPr>
+        <w:t xml:space="preserve">profissão: ___________________, inscrito(a) no CPF sob o nº: _______________________</w:t>
       </w:r>
       <w:r>
         <w:rPr>
@@ -189,13 +366,18 @@
         <w:ind w:left="-5"/>
         <w:jc w:val="left"/>
         <w:rPr>
-          <w:b/>
-          <w:bCs/>
+          <w:sz w:val="28"/>
+          <w:szCs w:val="28"/>
+          <w:lang w:val="pt-BR"/>
+        </w:rPr>
+      </w:pPr>
+      <w:r>
+        <w:rPr>
           <w:sz w:val="22"/>
           <w:szCs w:val="22"/>
           <w:lang w:val="pt-BR"/>
         </w:rPr>
-      </w:pPr>
+      </w:r>
       <w:r>
         <w:rPr>
           <w:sz w:val="22"/>
@@ -203,6 +385,36 @@
           <w:lang w:val="pt-BR"/>
         </w:rPr>
         <w:t xml:space="preserve">Têm entre si justo e contratado o presente instrumento, mediante as cláusulas e condições seguintes.</w:t>
+      </w:r>
+      <w:r>
+        <w:rPr>
+          <w:sz w:val="28"/>
+          <w:szCs w:val="28"/>
+          <w:lang w:val="pt-BR"/>
+        </w:rPr>
+      </w:r>
+      <w:r/>
+    </w:p>
+    <w:p>
+      <w:pPr>
+        <w:pBdr/>
+        <w:spacing w:line="276" w:lineRule="auto"/>
+        <w:ind w:left="-5"/>
+        <w:jc w:val="left"/>
+        <w:rPr>
+          <w:b/>
+          <w:bCs/>
+        </w:rPr>
+      </w:pPr>
+      <w:r>
+        <w:rPr>
+          <w:b/>
+          <w:bCs/>
+          <w:sz w:val="22"/>
+          <w:szCs w:val="22"/>
+          <w:lang w:val="pt-BR"/>
+        </w:rPr>
+        <w:t xml:space="preserve">CLÁUSULA PRIMEIRA – DO OBJETO E DA IDENTIFICAÇÃO DO IMÓVEL</w:t>
       </w:r>
       <w:r>
         <w:rPr>
@@ -217,207 +429,26 @@
         <w:rPr>
           <w:b/>
           <w:bCs/>
+        </w:rPr>
+      </w:r>
+    </w:p>
+    <w:p>
+      <w:pPr>
+        <w:pBdr/>
+        <w:spacing w:line="276" w:lineRule="auto"/>
+        <w:ind w:left="-5"/>
+        <w:jc w:val="left"/>
+        <w:rPr/>
+      </w:pPr>
+      <w:r>
+        <w:rPr>
+          <w:b w:val="0"/>
+          <w:bCs w:val="0"/>
           <w:sz w:val="22"/>
           <w:szCs w:val="22"/>
           <w:lang w:val="pt-BR"/>
         </w:rPr>
-      </w:r>
-    </w:p>
-    <w:p>
-      <w:pPr>
-        <w:pBdr/>
-        <w:spacing w:line="276" w:lineRule="auto"/>
-        <w:ind w:left="-5"/>
-        <w:jc w:val="left"/>
-        <w:rPr>
-          <w:b/>
-          <w:bCs/>
-          <w:sz w:val="22"/>
-          <w:szCs w:val="22"/>
-          <w:lang w:val="pt-BR"/>
-        </w:rPr>
-      </w:pPr>
-      <w:r>
-        <w:rPr>
-          <w:b/>
-          <w:bCs/>
-          <w:sz w:val="22"/>
-          <w:szCs w:val="22"/>
-          <w:lang w:val="pt-BR"/>
-        </w:rPr>
-        <w:t xml:space="preserve">CLÁUSULA PRIMEIRA - DO OBJETO</w:t>
-      </w:r>
-      <w:r>
-        <w:rPr>
-          <w:b/>
-          <w:bCs/>
-          <w:sz w:val="22"/>
-          <w:szCs w:val="22"/>
-          <w:lang w:val="pt-BR"/>
-        </w:rPr>
-      </w:r>
-      <w:r>
-        <w:rPr>
-          <w:b/>
-          <w:bCs/>
-          <w:sz w:val="22"/>
-          <w:szCs w:val="22"/>
-          <w:lang w:val="pt-BR"/>
-        </w:rPr>
-      </w:r>
-    </w:p>
-    <w:p>
-      <w:pPr>
-        <w:pBdr/>
-        <w:spacing w:line="276" w:lineRule="auto"/>
-        <w:ind w:left="-5"/>
-        <w:jc w:val="left"/>
-        <w:rPr>
-          <w:sz w:val="22"/>
-          <w:szCs w:val="22"/>
-          <w:highlight w:val="none"/>
-          <w:lang w:val="pt-BR"/>
-        </w:rPr>
-      </w:pPr>
-      <w:r>
-        <w:rPr>
-          <w:sz w:val="22"/>
-          <w:szCs w:val="22"/>
-          <w:lang w:val="pt-BR"/>
-        </w:rPr>
-        <w:t xml:space="preserve">O(A) VENDEDOR(A) declara </w:t>
-      </w:r>
-      <w:r>
-        <w:rPr>
-          <w:sz w:val="22"/>
-          <w:szCs w:val="22"/>
-          <w:lang w:val="pt-BR"/>
-        </w:rPr>
-        <w:t xml:space="preserve">ser legítimo(a) proprietário(a) do imóvel constituído por</w:t>
-      </w:r>
-      <w:r>
-        <w:rPr>
-          <w:sz w:val="22"/>
-          <w:szCs w:val="22"/>
-          <w:lang w:val="pt-BR"/>
-        </w:rPr>
-        <w:t xml:space="preserve">, quantidade: ________ tipo: ______________</w:t>
-      </w:r>
-      <w:r>
-        <w:rPr>
-          <w:sz w:val="22"/>
-          <w:szCs w:val="22"/>
-          <w:lang w:val="pt-BR"/>
-        </w:rPr>
-        <w:t xml:space="preserve">________________, situado(a) em ______________________________________________________________________________ Município: ________________________________, Estado: _____________________________, f</w:t>
-      </w:r>
-      <w:r>
-        <w:rPr>
-          <w:sz w:val="22"/>
-          <w:szCs w:val="22"/>
-          <w:lang w:val="pt-BR"/>
-        </w:rPr>
-        <w:t xml:space="preserve">rente medindo ______ metros, confrontando com ____________________________________, fundos: medindo ______ metros, confrontando com ___________________________________, lado direito: medindo ______ metros, confrontando com _______________________________, </w:t>
-      </w:r>
-      <w:r>
-        <w:rPr>
-          <w:sz w:val="22"/>
-          <w:szCs w:val="22"/>
-          <w:lang w:val="pt-BR"/>
-        </w:rPr>
-        <w:t xml:space="preserve">lado esquerdo: medindo ______ metros, confrontando com _____________________________, </w:t>
-      </w:r>
-      <w:r>
-        <w:rPr>
-          <w:sz w:val="22"/>
-          <w:szCs w:val="22"/>
-          <w:lang w:val="pt-BR"/>
-        </w:rPr>
-        <w:t xml:space="preserve">com as seguintes características: ___________________________________________________ ________</w:t>
-      </w:r>
-      <w:r>
-        <w:rPr>
-          <w:sz w:val="22"/>
-          <w:szCs w:val="22"/>
-          <w:lang w:val="pt-BR"/>
-        </w:rPr>
-        <w:t xml:space="preserve">______________________________________________________________________, perfazendo área total de ___________ m² (___________________________________________), </w:t>
-      </w:r>
-      <w:r>
-        <w:rPr>
-          <w:sz w:val="22"/>
-          <w:szCs w:val="22"/>
-          <w:lang w:val="pt-BR"/>
-        </w:rPr>
-        <w:t xml:space="preserve">matriculado sob o nº ____________________________ no Cartório de Registro de Imóveis de ____________________________ - ______________________.</w:t>
-      </w:r>
-      <w:r>
-        <w:rPr>
-          <w:sz w:val="22"/>
-          <w:szCs w:val="22"/>
-          <w:lang w:val="pt-BR"/>
-        </w:rPr>
-      </w:r>
-      <w:r>
-        <w:rPr>
-          <w:sz w:val="22"/>
-          <w:szCs w:val="22"/>
-          <w:lang w:val="pt-BR"/>
-        </w:rPr>
-      </w:r>
-      <w:r>
-        <w:rPr>
-          <w:sz w:val="22"/>
-          <w:szCs w:val="22"/>
-          <w:highlight w:val="none"/>
-          <w:lang w:val="pt-BR" w:bidi="pt-BR"/>
-        </w:rPr>
-      </w:r>
-      <w:r>
-        <w:rPr>
-          <w:sz w:val="22"/>
-          <w:szCs w:val="22"/>
-          <w:highlight w:val="none"/>
-          <w:lang w:val="pt-BR" w:bidi="pt-BR"/>
-        </w:rPr>
-      </w:r>
-      <w:r>
-        <w:rPr>
-          <w:sz w:val="22"/>
-          <w:szCs w:val="22"/>
-          <w:highlight w:val="none"/>
-          <w:lang w:val="pt-BR"/>
-        </w:rPr>
-      </w:r>
-      <w:r>
-        <w:rPr>
-          <w:sz w:val="22"/>
-          <w:szCs w:val="22"/>
-          <w:highlight w:val="none"/>
-          <w:lang w:val="pt-BR"/>
-        </w:rPr>
-      </w:r>
-    </w:p>
-    <w:p>
-      <w:pPr>
-        <w:pBdr/>
-        <w:spacing w:line="276" w:lineRule="auto"/>
-        <w:ind w:left="-5"/>
-        <w:jc w:val="left"/>
-        <w:rPr>
-          <w:b w:val="0"/>
-          <w:bCs w:val="0"/>
-        </w:rPr>
-      </w:pPr>
-      <w:r>
-        <w:rPr>
-          <w:b/>
-          <w:bCs/>
-          <w:sz w:val="22"/>
-          <w:szCs w:val="22"/>
-          <w:lang w:val="pt-BR"/>
-        </w:rPr>
-        <w:t xml:space="preserve">Parágrafo primeiro.</w:t>
+        <w:t xml:space="preserve">Imóvel constituído por, quantidade: _______ (__________) tipo: _________________, identificado como ___________ nº ________, da Quadra nº ________, integrante do Loteamento/Desmembramento denominado ____________________</w:t>
       </w:r>
       <w:r>
         <w:rPr>
@@ -427,50 +458,7 @@
           <w:szCs w:val="22"/>
           <w:lang w:val="pt-BR"/>
         </w:rPr>
-        <w:t xml:space="preserve"> O(A) VENDEDOR(A) declara que o imóvel possui matrícula individualizada e título de propriedade registrado no Cartório de Registro de Imóveis, encontrando-se em condições de ser objeto da presente compra e venda.</w:t>
-      </w:r>
-      <w:r>
-        <w:rPr>
-          <w:b w:val="0"/>
-          <w:bCs w:val="0"/>
-        </w:rPr>
-      </w:r>
-      <w:r>
-        <w:rPr>
-          <w:b w:val="0"/>
-          <w:bCs w:val="0"/>
-        </w:rPr>
-      </w:r>
-    </w:p>
-    <w:p>
-      <w:pPr>
-        <w:pBdr/>
-        <w:spacing w:line="276" w:lineRule="auto"/>
-        <w:ind w:left="-5"/>
-        <w:jc w:val="left"/>
-        <w:rPr>
-          <w:b w:val="0"/>
-          <w:bCs w:val="0"/>
-          <w:sz w:val="22"/>
-          <w:szCs w:val="22"/>
-          <w:lang w:val="pt-BR"/>
-        </w:rPr>
-      </w:pPr>
-      <w:r>
-        <w:rPr>
-          <w:b w:val="0"/>
-          <w:bCs w:val="0"/>
-        </w:rPr>
-      </w:r>
-      <w:r>
-        <w:rPr>
-          <w:b/>
-          <w:bCs/>
-          <w:sz w:val="22"/>
-          <w:szCs w:val="22"/>
-          <w:lang w:val="pt-BR"/>
-        </w:rPr>
-        <w:t xml:space="preserve">Parágrafo segundo.</w:t>
+        <w:t xml:space="preserve">______________________, situado em  _______________________________</w:t>
       </w:r>
       <w:r>
         <w:rPr>
@@ -480,331 +468,7 @@
           <w:szCs w:val="22"/>
           <w:lang w:val="pt-BR"/>
         </w:rPr>
-        <w:t xml:space="preserve"> O presente instrumento tem por objeto a compra e venda do imóvel descrito nesta cláusula, observada a forma legal exigida para a transmissão da propriedade.</w:t>
-      </w:r>
-      <w:r>
-        <w:rPr>
-          <w:b w:val="0"/>
-          <w:bCs w:val="0"/>
-          <w:sz w:val="22"/>
-          <w:szCs w:val="22"/>
-          <w:lang w:val="pt-BR"/>
-        </w:rPr>
-      </w:r>
-      <w:r>
-        <w:rPr>
-          <w:b w:val="0"/>
-          <w:bCs w:val="0"/>
-          <w:sz w:val="22"/>
-          <w:szCs w:val="22"/>
-          <w:lang w:val="pt-BR"/>
-        </w:rPr>
-      </w:r>
-    </w:p>
-    <w:p>
-      <w:pPr>
-        <w:pBdr/>
-        <w:spacing w:line="276" w:lineRule="auto"/>
-        <w:ind w:left="-5"/>
-        <w:jc w:val="left"/>
-        <w:rPr>
-          <w:b w:val="0"/>
-          <w:bCs w:val="0"/>
-          <w:sz w:val="22"/>
-          <w:szCs w:val="22"/>
-          <w:highlight w:val="none"/>
-          <w:lang w:val="pt-BR"/>
-        </w:rPr>
-      </w:pPr>
-      <w:r>
-        <w:rPr>
-          <w:b w:val="0"/>
-          <w:bCs w:val="0"/>
-          <w:sz w:val="22"/>
-          <w:szCs w:val="22"/>
-          <w:lang w:val="pt-BR"/>
-        </w:rPr>
-      </w:r>
-      <w:r>
-        <w:rPr>
-          <w:b/>
-          <w:bCs/>
-          <w:sz w:val="22"/>
-          <w:szCs w:val="22"/>
-          <w:lang w:val="pt-BR"/>
-        </w:rPr>
-        <w:t xml:space="preserve">Parágrafo terceiro.</w:t>
-      </w:r>
-      <w:r>
-        <w:rPr>
-          <w:b w:val="0"/>
-          <w:bCs w:val="0"/>
-          <w:sz w:val="22"/>
-          <w:szCs w:val="22"/>
-          <w:lang w:val="pt-BR"/>
-        </w:rPr>
-        <w:t xml:space="preserve"> O(A) COMPRADOR(A) declara conhecer a localização, dimensões, limites físicos e estado atual do imóvel, aceitando-o nas condições em que se encontra.</w:t>
-      </w:r>
-      <w:r>
-        <w:rPr>
-          <w:b w:val="0"/>
-          <w:bCs w:val="0"/>
-          <w:sz w:val="22"/>
-          <w:szCs w:val="22"/>
-          <w:lang w:val="pt-BR"/>
-        </w:rPr>
-      </w:r>
-      <w:r>
-        <w:rPr>
-          <w:b w:val="0"/>
-          <w:bCs w:val="0"/>
-          <w:sz w:val="22"/>
-          <w:szCs w:val="22"/>
-          <w:lang w:val="pt-BR"/>
-        </w:rPr>
-      </w:r>
-      <w:r>
-        <w:rPr>
-          <w:b w:val="0"/>
-          <w:bCs w:val="0"/>
-          <w:sz w:val="22"/>
-          <w:szCs w:val="22"/>
-          <w:lang w:val="pt-BR"/>
-        </w:rPr>
-      </w:r>
-    </w:p>
-    <w:p>
-      <w:pPr>
-        <w:pBdr/>
-        <w:spacing w:line="276" w:lineRule="auto"/>
-        <w:ind w:left="-5"/>
-        <w:jc w:val="left"/>
-        <w:rPr>
-          <w:b w:val="0"/>
-          <w:bCs w:val="0"/>
-          <w:sz w:val="22"/>
-          <w:szCs w:val="22"/>
-          <w:lang w:val="pt-BR"/>
-        </w:rPr>
-      </w:pPr>
-      <w:r>
-        <w:rPr>
-          <w:b w:val="0"/>
-          <w:bCs w:val="0"/>
-          <w:sz w:val="22"/>
-          <w:szCs w:val="22"/>
-          <w:lang w:val="pt-BR"/>
-        </w:rPr>
-      </w:r>
-      <w:r>
-        <w:rPr>
-          <w:b w:val="0"/>
-          <w:bCs w:val="0"/>
-          <w:sz w:val="22"/>
-          <w:szCs w:val="22"/>
-          <w:lang w:val="pt-BR"/>
-        </w:rPr>
-      </w:r>
-      <w:r>
-        <w:rPr>
-          <w:b w:val="0"/>
-          <w:bCs w:val="0"/>
-          <w:sz w:val="22"/>
-          <w:szCs w:val="22"/>
-          <w:lang w:val="pt-BR"/>
-        </w:rPr>
-      </w:r>
-    </w:p>
-    <w:p>
-      <w:pPr>
-        <w:pBdr/>
-        <w:spacing w:line="276" w:lineRule="auto"/>
-        <w:ind w:left="-5"/>
-        <w:jc w:val="left"/>
-        <w:rPr>
-          <w:b w:val="0"/>
-          <w:bCs w:val="0"/>
-          <w:sz w:val="22"/>
-          <w:szCs w:val="22"/>
-          <w:lang w:val="pt-BR"/>
-        </w:rPr>
-      </w:pPr>
-      <w:r>
-        <w:rPr>
-          <w:b w:val="0"/>
-          <w:bCs w:val="0"/>
-          <w:sz w:val="22"/>
-          <w:szCs w:val="22"/>
-          <w:lang w:val="pt-BR"/>
-        </w:rPr>
-      </w:r>
-      <w:r>
-        <w:rPr>
-          <w:b w:val="0"/>
-          <w:bCs w:val="0"/>
-          <w:sz w:val="22"/>
-          <w:szCs w:val="22"/>
-          <w:lang w:val="pt-BR"/>
-        </w:rPr>
-      </w:r>
-      <w:r>
-        <w:rPr>
-          <w:b w:val="0"/>
-          <w:bCs w:val="0"/>
-          <w:sz w:val="22"/>
-          <w:szCs w:val="22"/>
-          <w:lang w:val="pt-BR"/>
-        </w:rPr>
-      </w:r>
-    </w:p>
-    <w:p>
-      <w:pPr>
-        <w:pBdr/>
-        <w:spacing w:line="276" w:lineRule="auto"/>
-        <w:ind w:left="-5"/>
-        <w:jc w:val="left"/>
-        <w:rPr>
-          <w:b w:val="0"/>
-          <w:bCs w:val="0"/>
-          <w:sz w:val="22"/>
-          <w:szCs w:val="22"/>
-          <w:lang w:val="pt-BR"/>
-        </w:rPr>
-      </w:pPr>
-      <w:r>
-        <w:rPr>
-          <w:b w:val="0"/>
-          <w:bCs w:val="0"/>
-          <w:sz w:val="22"/>
-          <w:szCs w:val="22"/>
-          <w:lang w:val="pt-BR"/>
-        </w:rPr>
-      </w:r>
-      <w:r>
-        <w:rPr>
-          <w:b w:val="0"/>
-          <w:bCs w:val="0"/>
-          <w:sz w:val="22"/>
-          <w:szCs w:val="22"/>
-          <w:lang w:val="pt-BR"/>
-        </w:rPr>
-      </w:r>
-      <w:r>
-        <w:rPr>
-          <w:b w:val="0"/>
-          <w:bCs w:val="0"/>
-          <w:sz w:val="22"/>
-          <w:szCs w:val="22"/>
-          <w:lang w:val="pt-BR"/>
-        </w:rPr>
-      </w:r>
-    </w:p>
-    <w:p>
-      <w:pPr>
-        <w:pBdr/>
-        <w:spacing w:line="276" w:lineRule="auto"/>
-        <w:ind w:left="-5"/>
-        <w:jc w:val="left"/>
-        <w:rPr>
-          <w:b w:val="0"/>
-          <w:bCs w:val="0"/>
-          <w:sz w:val="22"/>
-          <w:szCs w:val="22"/>
-          <w:lang w:val="pt-BR"/>
-        </w:rPr>
-      </w:pPr>
-      <w:r>
-        <w:rPr>
-          <w:b w:val="0"/>
-          <w:bCs w:val="0"/>
-          <w:sz w:val="22"/>
-          <w:szCs w:val="22"/>
-          <w:lang w:val="pt-BR"/>
-        </w:rPr>
-      </w:r>
-      <w:r>
-        <w:rPr>
-          <w:b w:val="0"/>
-          <w:bCs w:val="0"/>
-          <w:sz w:val="22"/>
-          <w:szCs w:val="22"/>
-          <w:lang w:val="pt-BR"/>
-        </w:rPr>
-      </w:r>
-      <w:r>
-        <w:rPr>
-          <w:b w:val="0"/>
-          <w:bCs w:val="0"/>
-          <w:sz w:val="22"/>
-          <w:szCs w:val="22"/>
-          <w:lang w:val="pt-BR"/>
-        </w:rPr>
-      </w:r>
-    </w:p>
-    <w:p>
-      <w:pPr>
-        <w:pBdr/>
-        <w:spacing w:line="276" w:lineRule="auto"/>
-        <w:ind w:left="-5"/>
-        <w:jc w:val="left"/>
-        <w:rPr>
-          <w:b/>
-          <w:bCs/>
-        </w:rPr>
-      </w:pPr>
-      <w:r>
-        <w:rPr>
-          <w:b/>
-          <w:bCs/>
-          <w:sz w:val="22"/>
-          <w:szCs w:val="22"/>
-          <w:lang w:val="pt-BR"/>
-        </w:rPr>
-        <w:t xml:space="preserve">CLÁUSULA PRIMEIRA – DO OBJETO E DA IDENTIFICAÇÃO DO IMÓVEL</w:t>
-      </w:r>
-      <w:r>
-        <w:rPr>
-          <w:b/>
-          <w:bCs/>
-        </w:rPr>
-      </w:r>
-      <w:r>
-        <w:rPr>
-          <w:b/>
-          <w:bCs/>
-          <w:sz w:val="22"/>
-          <w:szCs w:val="22"/>
-          <w:lang w:val="pt-BR"/>
-        </w:rPr>
-      </w:r>
-    </w:p>
-    <w:p>
-      <w:pPr>
-        <w:pBdr/>
-        <w:spacing w:line="276" w:lineRule="auto"/>
-        <w:ind w:left="-5"/>
-        <w:jc w:val="left"/>
-        <w:rPr/>
-      </w:pPr>
-      <w:r>
-        <w:rPr>
-          <w:b w:val="0"/>
-          <w:bCs w:val="0"/>
-          <w:sz w:val="22"/>
-          <w:szCs w:val="22"/>
-          <w:lang w:val="pt-BR"/>
-        </w:rPr>
-        <w:t xml:space="preserve">O(A) VENDEDOR(A) declara ser legítimo(a) proprietário(a) do imóvel constituído por, quantidade: _______ (__________) tipo: _________________, identificado como ___________ nº ________, da Quadra nº ________, integrante do Loteamento/Desmembramento denominado ____________________</w:t>
-      </w:r>
-      <w:r>
-        <w:rPr>
-          <w:b w:val="0"/>
-          <w:bCs w:val="0"/>
-          <w:sz w:val="22"/>
-          <w:szCs w:val="22"/>
-          <w:lang w:val="pt-BR"/>
-        </w:rPr>
-        <w:t xml:space="preserve">______________________, situado em  __________________________________________________________________, nº ________, Complemento: _________________________ Bairro/Setor ______________________________, Município: __________________________________, Estado: ____________________________, CEP ________, com as seguintes caract</w:t>
+        <w:t xml:space="preserve">___________________________________, nº ________, Complemento: _________________________ Bairro/Setor ______________________________, Município: __________________________________, Estado: ____________________________, CEP ________, com as seguintes caract</w:t>
       </w:r>
       <w:r>
         <w:rPr>
@@ -815,15 +479,6 @@
           <w:lang w:val="pt-BR"/>
         </w:rPr>
         <w:t xml:space="preserve">erísticas: ______________________________________________________________________________, </w:t>
-      </w:r>
-      <w:r>
-        <w:rPr>
-          <w:b w:val="0"/>
-          <w:bCs w:val="0"/>
-          <w:sz w:val="22"/>
-          <w:szCs w:val="22"/>
-          <w:lang w:val="pt-BR"/>
-        </w:rPr>
       </w:r>
       <w:r>
         <w:rPr>
@@ -839,7 +494,15 @@
           <w:szCs w:val="22"/>
           <w:lang w:val="pt-BR"/>
         </w:rPr>
-        <w:t xml:space="preserve">rente medindo ______ metros, confrontando com _____________________________________, fundos medindo ______ metros, confrontando com ____________________________________, lado direito medindo ______ metros, confrontando com _________________________________, </w:t>
+        <w:t xml:space="preserve">re</w:t>
+      </w:r>
+      <w:r>
+        <w:rPr>
+          <w:sz w:val="22"/>
+          <w:szCs w:val="22"/>
+          <w:lang w:val="pt-BR"/>
+        </w:rPr>
+        <w:t xml:space="preserve">nte medindo ______ metros, confrontando com _____________________________________, fundos medindo ______ metros, confrontando com ____________________________________, lado direito medindo ______ metros, confrontando com _________________________________, </w:t>
       </w:r>
       <w:r>
         <w:rPr>
@@ -879,6 +542,47 @@
         </w:rPr>
         <w:t xml:space="preserve">Registro do título de propriedade: ______________________________, constante da matrícula acima indicada,</w:t>
       </w:r>
+      <w:r>
+        <w:rPr>
+          <w:b w:val="0"/>
+          <w:bCs w:val="0"/>
+          <w:sz w:val="22"/>
+          <w:szCs w:val="22"/>
+          <w:lang w:val="pt-BR"/>
+        </w:rPr>
+        <w:t xml:space="preserve"> inscrição imobiliária/cadastro municipal nº  ______________________________, perante o Município de __________________________________________, </w:t>
+      </w:r>
+      <w:r>
+        <w:rPr>
+          <w:b w:val="0"/>
+          <w:bCs w:val="0"/>
+          <w:sz w:val="22"/>
+          <w:szCs w:val="22"/>
+          <w:lang w:val="pt-BR"/>
+        </w:rPr>
+        <w:t xml:space="preserve">registro do loteamento/desmembramento nº ______________________________, </w:t>
+      </w:r>
+      <w:r>
+        <w:rPr>
+          <w:b w:val="0"/>
+          <w:bCs w:val="0"/>
+          <w:sz w:val="22"/>
+          <w:szCs w:val="22"/>
+          <w:lang w:val="pt-BR"/>
+        </w:rPr>
+        <w:t xml:space="preserve">perante</w:t>
+      </w:r>
+      <w:r>
+        <w:rPr>
+          <w:b w:val="0"/>
+          <w:bCs w:val="0"/>
+          <w:sz w:val="22"/>
+          <w:szCs w:val="22"/>
+          <w:lang w:val="pt-BR"/>
+        </w:rPr>
+        <w:t xml:space="preserve"> o Cartório de Registro de Imóveis de __________________________________________, quando aplicável.</w:t>
+      </w:r>
+      <w:r/>
       <w:r/>
       <w:r>
         <w:rPr>
@@ -889,6 +593,8 @@
           <w:lang w:val="pt-BR"/>
         </w:rPr>
       </w:r>
+      <w:r/>
+      <w:r/>
     </w:p>
     <w:p>
       <w:pPr>
@@ -898,6 +604,26 @@
         <w:jc w:val="left"/>
         <w:rPr/>
       </w:pPr>
+      <w:r>
+        <w:rPr>
+          <w:b/>
+          <w:bCs/>
+          <w:sz w:val="22"/>
+          <w:szCs w:val="22"/>
+          <w:lang w:val="pt-BR"/>
+        </w:rPr>
+        <w:t xml:space="preserve">P</w:t>
+      </w:r>
+      <w:r>
+        <w:rPr>
+          <w:b/>
+          <w:bCs/>
+          <w:sz w:val="22"/>
+          <w:szCs w:val="22"/>
+          <w:lang w:val="pt-BR"/>
+        </w:rPr>
+        <w:t xml:space="preserve">arágrafo Primeiro.</w:t>
+      </w:r>
       <w:r>
         <w:rPr>
           <w:b w:val="0"/>
@@ -906,104 +632,7 @@
           <w:szCs w:val="22"/>
           <w:lang w:val="pt-BR"/>
         </w:rPr>
-      </w:r>
-      <w:r/>
-    </w:p>
-    <w:p>
-      <w:pPr>
-        <w:pBdr/>
-        <w:spacing w:line="276" w:lineRule="auto"/>
-        <w:ind w:left="-5"/>
-        <w:jc w:val="left"/>
-        <w:rPr/>
-      </w:pPr>
-      <w:r>
-        <w:rPr>
-          <w:b w:val="0"/>
-          <w:bCs w:val="0"/>
-          <w:sz w:val="22"/>
-          <w:szCs w:val="22"/>
-          <w:lang w:val="pt-BR"/>
-        </w:rPr>
-        <w:t xml:space="preserve">h) Inscrição imobiliária/cadastro municipal nº: ______________________________, perante o Município de __________________________________________;</w:t>
-      </w:r>
-      <w:r/>
-    </w:p>
-    <w:p>
-      <w:pPr>
-        <w:pBdr/>
-        <w:spacing w:line="276" w:lineRule="auto"/>
-        <w:ind w:left="-5"/>
-        <w:jc w:val="left"/>
-        <w:rPr/>
-      </w:pPr>
-      <w:r>
-        <w:rPr>
-          <w:b w:val="0"/>
-          <w:bCs w:val="0"/>
-          <w:sz w:val="22"/>
-          <w:szCs w:val="22"/>
-          <w:lang w:val="pt-BR"/>
-        </w:rPr>
-      </w:r>
-      <w:r/>
-    </w:p>
-    <w:p>
-      <w:pPr>
-        <w:pBdr/>
-        <w:spacing w:line="276" w:lineRule="auto"/>
-        <w:ind w:left="-5"/>
-        <w:jc w:val="left"/>
-        <w:rPr/>
-      </w:pPr>
-      <w:r>
-        <w:rPr>
-          <w:b w:val="0"/>
-          <w:bCs w:val="0"/>
-          <w:sz w:val="22"/>
-          <w:szCs w:val="22"/>
-          <w:lang w:val="pt-BR"/>
-        </w:rPr>
-        <w:t xml:space="preserve">i) Registro do loteamento/desmembramento: registrado sob nº ______________________________, no Cartório de Registro de Imóveis de __________________________________________, quando aplicável.</w:t>
-      </w:r>
-      <w:r/>
-    </w:p>
-    <w:p>
-      <w:pPr>
-        <w:pBdr/>
-        <w:spacing w:line="276" w:lineRule="auto"/>
-        <w:ind w:left="-5"/>
-        <w:jc w:val="left"/>
-        <w:rPr/>
-      </w:pPr>
-      <w:r>
-        <w:rPr>
-          <w:b w:val="0"/>
-          <w:bCs w:val="0"/>
-          <w:sz w:val="22"/>
-          <w:szCs w:val="22"/>
-          <w:lang w:val="pt-BR"/>
-        </w:rPr>
-      </w:r>
-      <w:r/>
-    </w:p>
-    <w:p>
-      <w:pPr>
-        <w:pBdr/>
-        <w:spacing w:line="276" w:lineRule="auto"/>
-        <w:ind w:left="-5"/>
-        <w:jc w:val="left"/>
-        <w:rPr/>
-      </w:pPr>
-      <w:r>
-        <w:rPr>
-          <w:b w:val="0"/>
-          <w:bCs w:val="0"/>
-          <w:sz w:val="22"/>
-          <w:szCs w:val="22"/>
-          <w:lang w:val="pt-BR"/>
-        </w:rPr>
-        <w:t xml:space="preserve">Parágrafo Primeiro. O(A) VENDEDOR(A) declara que o imóvel objeto deste contrato possui matrícula individualizada perante o Cartório de Registro de Imóveis competente e que o lote acima descrito corresponde integralmente ao imóvel constante da respectiva mat</w:t>
+        <w:t xml:space="preserve"> O(A) VENDEDOR(A) declara que o imóvel objeto deste contrato possui matrícula individualizada perante o Cartório de Registro de Imóveis competente e que o lote acima descrito corresponde integralmente ao imóvel constante da respectiva mat</w:t>
       </w:r>
       <w:r>
         <w:rPr>
@@ -1046,13 +675,33 @@
       </w:pPr>
       <w:r>
         <w:rPr>
+          <w:b/>
+          <w:bCs/>
+          <w:sz w:val="22"/>
+          <w:szCs w:val="22"/>
+          <w:lang w:val="pt-BR"/>
+        </w:rPr>
+        <w:t xml:space="preserve">P</w:t>
+      </w:r>
+      <w:r>
+        <w:rPr>
+          <w:b/>
+          <w:bCs/>
+          <w:sz w:val="22"/>
+          <w:szCs w:val="22"/>
+          <w:lang w:val="pt-BR"/>
+        </w:rPr>
+        <w:t xml:space="preserve">arágrafo Segundo.</w:t>
+      </w:r>
+      <w:r>
+        <w:rPr>
           <w:b w:val="0"/>
           <w:bCs w:val="0"/>
           <w:sz w:val="22"/>
           <w:szCs w:val="22"/>
           <w:lang w:val="pt-BR"/>
         </w:rPr>
-        <w:t xml:space="preserve">Parágrafo Segundo. O(A) VENDEDOR(A) declara que a descrição, área, medidas, confrontações, localização, identificação do lote, quadra e demais características do imóvel correspondem às informações constantes da respectiva matrícula e dos documentos oficiais</w:t>
+        <w:t xml:space="preserve"> O(A) VENDEDOR(A) declara que a descrição, área, medidas, confrontações, localização, identificação do lote, quadra e demais características do imóvel correspondem às informações constantes da respectiva matrícula e dos documentos oficiais</w:t>
       </w:r>
       <w:r>
         <w:rPr>
@@ -1065,15 +714,6 @@
         <w:t xml:space="preserve"> aplicáveis ao imóvel.</w:t>
       </w:r>
       <w:r/>
-    </w:p>
-    <w:p>
-      <w:pPr>
-        <w:pBdr/>
-        <w:spacing w:line="276" w:lineRule="auto"/>
-        <w:ind w:left="-5"/>
-        <w:jc w:val="left"/>
-        <w:rPr/>
-      </w:pPr>
       <w:r>
         <w:rPr>
           <w:b w:val="0"/>
@@ -1084,6 +724,7 @@
         </w:rPr>
       </w:r>
       <w:r/>
+      <w:r/>
     </w:p>
     <w:p>
       <w:pPr>
@@ -1093,6 +734,26 @@
         <w:jc w:val="left"/>
         <w:rPr/>
       </w:pPr>
+      <w:r>
+        <w:rPr>
+          <w:b/>
+          <w:bCs/>
+          <w:sz w:val="22"/>
+          <w:szCs w:val="22"/>
+          <w:lang w:val="pt-BR"/>
+        </w:rPr>
+        <w:t xml:space="preserve">P</w:t>
+      </w:r>
+      <w:r>
+        <w:rPr>
+          <w:b/>
+          <w:bCs/>
+          <w:sz w:val="22"/>
+          <w:szCs w:val="22"/>
+          <w:lang w:val="pt-BR"/>
+        </w:rPr>
+        <w:t xml:space="preserve">arágrafo Terceiro.</w:t>
+      </w:r>
       <w:r>
         <w:rPr>
           <w:b w:val="0"/>
@@ -1101,7 +762,7 @@
           <w:szCs w:val="22"/>
           <w:lang w:val="pt-BR"/>
         </w:rPr>
-        <w:t xml:space="preserve">Parágrafo Terceiro. O(A) COMPRADOR(A) declara ter tido conhecimento da localização, identificação, área, medidas, confrontações e demais características do imóvel, podendo examiná-lo e conferir sua correspondência com a documentação apresentada pelo(a) VEND</w:t>
+        <w:t xml:space="preserve"> O(A) COMPRADOR(A) declara ter tido conhecimento da localização, identificação, área, medidas, confrontações e demais características do imóvel, podendo examiná-lo e conferir sua correspondência com a documentação apresentada pelo(a) VEND</w:t>
       </w:r>
       <w:r>
         <w:rPr>
@@ -1114,15 +775,6 @@
         <w:t xml:space="preserve">EDOR(A).</w:t>
       </w:r>
       <w:r/>
-    </w:p>
-    <w:p>
-      <w:pPr>
-        <w:pBdr/>
-        <w:spacing w:line="276" w:lineRule="auto"/>
-        <w:ind w:left="-5"/>
-        <w:jc w:val="left"/>
-        <w:rPr/>
-      </w:pPr>
       <w:r>
         <w:rPr>
           <w:b w:val="0"/>
@@ -1133,6 +785,7 @@
         </w:rPr>
       </w:r>
       <w:r/>
+      <w:r/>
     </w:p>
     <w:p>
       <w:pPr>
@@ -1142,6 +795,16 @@
         <w:jc w:val="left"/>
         <w:rPr/>
       </w:pPr>
+      <w:r>
+        <w:rPr>
+          <w:b/>
+          <w:bCs/>
+          <w:sz w:val="22"/>
+          <w:szCs w:val="22"/>
+          <w:lang w:val="pt-BR"/>
+        </w:rPr>
+        <w:t xml:space="preserve">Parágrafo Quarto.</w:t>
+      </w:r>
       <w:r>
         <w:rPr>
           <w:b w:val="0"/>
@@ -1150,18 +813,9 @@
           <w:szCs w:val="22"/>
           <w:lang w:val="pt-BR"/>
         </w:rPr>
-        <w:t xml:space="preserve">Parágrafo Quarto. A presente compra e venda refere-se exclusivamente ao imóvel individualizado nesta cláusula, não abrangendo outros lotes, áreas ou direitos pertencentes ao(à) VENDEDOR(A), ainda que integrantes do mesmo loteamento ou imóvel de origem.</w:t>
+        <w:t xml:space="preserve"> A presente compra e venda refere-se exclusivamente ao imóvel individualizado nesta cláusula, não abrangendo outros lotes, áreas ou direitos pertencentes ao(à) VENDEDOR(A), ainda que integrantes do mesmo loteamento ou imóvel de origem.</w:t>
       </w:r>
       <w:r/>
-    </w:p>
-    <w:p>
-      <w:pPr>
-        <w:pBdr/>
-        <w:spacing w:line="276" w:lineRule="auto"/>
-        <w:ind w:left="-5"/>
-        <w:jc w:val="left"/>
-        <w:rPr/>
-      </w:pPr>
       <w:r>
         <w:rPr>
           <w:b w:val="0"/>
@@ -1172,6 +826,7 @@
         </w:rPr>
       </w:r>
       <w:r/>
+      <w:r/>
     </w:p>
     <w:p>
       <w:pPr>
@@ -1189,15 +844,24 @@
       </w:pPr>
       <w:r>
         <w:rPr>
+          <w:b/>
+          <w:bCs/>
+          <w:sz w:val="22"/>
+          <w:szCs w:val="22"/>
+          <w:lang w:val="pt-BR"/>
+        </w:rPr>
+        <w:t xml:space="preserve">Parágrafo Quinto.</w:t>
+      </w:r>
+      <w:r>
+        <w:rPr>
           <w:b w:val="0"/>
           <w:bCs w:val="0"/>
           <w:sz w:val="22"/>
           <w:szCs w:val="22"/>
           <w:lang w:val="pt-BR"/>
         </w:rPr>
-        <w:t xml:space="preserve">Parágrafo Quinto. A transferência da propriedade do imóvel observará a forma legalmente exigida, ficando as partes obrigadas a praticar os atos necessários à lavratura do título competente e ao respectivo registro no Cartório de Registro de Imóveis.</w:t>
+        <w:t xml:space="preserve"> A transferência da propriedade do imóvel observará a forma legalmente exigida, ficando as partes obrigadas a praticar os atos necessários à lavratura do título competente e ao respectivo registro no Cartório de Registro de Imóveis.</w:t>
       </w:r>
-      <w:r/>
       <w:r>
         <w:rPr>
           <w:b w:val="0"/>
@@ -1222,30 +886,17 @@
           <w:bCs w:val="0"/>
           <w:sz w:val="22"/>
           <w:szCs w:val="22"/>
-          <w:lang w:val="pt-BR"/>
+          <w:highlight w:val="none"/>
+          <w:lang w:val="pt-BR" w:bidi="pt-BR"/>
         </w:rPr>
       </w:r>
-    </w:p>
-    <w:p>
-      <w:pPr>
-        <w:pBdr/>
-        <w:spacing w:line="276" w:lineRule="auto"/>
-        <w:ind w:left="-5"/>
-        <w:jc w:val="left"/>
-        <w:rPr>
-          <w:b w:val="0"/>
-          <w:bCs w:val="0"/>
-          <w:sz w:val="22"/>
-          <w:szCs w:val="22"/>
-          <w:lang w:val="pt-BR"/>
-        </w:rPr>
-      </w:pPr>
       <w:r>
         <w:rPr>
           <w:b w:val="0"/>
           <w:bCs w:val="0"/>
           <w:sz w:val="22"/>
           <w:szCs w:val="22"/>
+          <w:highlight w:val="none"/>
           <w:lang w:val="pt-BR"/>
         </w:rPr>
       </w:r>
@@ -1264,51 +915,6 @@
           <w:bCs w:val="0"/>
           <w:sz w:val="22"/>
           <w:szCs w:val="22"/>
-          <w:lang w:val="pt-BR"/>
-        </w:rPr>
-      </w:r>
-    </w:p>
-    <w:p>
-      <w:pPr>
-        <w:pBdr/>
-        <w:spacing w:line="276" w:lineRule="auto"/>
-        <w:ind w:left="-5"/>
-        <w:jc w:val="left"/>
-        <w:rPr>
-          <w:b w:val="0"/>
-          <w:bCs w:val="0"/>
-          <w:sz w:val="22"/>
-          <w:szCs w:val="22"/>
-          <w:lang w:val="pt-BR"/>
-        </w:rPr>
-      </w:pPr>
-      <w:r>
-        <w:rPr>
-          <w:b w:val="0"/>
-          <w:bCs w:val="0"/>
-          <w:sz w:val="22"/>
-          <w:szCs w:val="22"/>
-          <w:highlight w:val="none"/>
-          <w:lang w:val="pt-BR" w:bidi="pt-BR"/>
-        </w:rPr>
-      </w:r>
-      <w:r>
-        <w:rPr>
-          <w:b w:val="0"/>
-          <w:bCs w:val="0"/>
-          <w:sz w:val="22"/>
-          <w:szCs w:val="22"/>
-          <w:highlight w:val="none"/>
-          <w:lang w:val="pt-BR" w:bidi="pt-BR"/>
-        </w:rPr>
-      </w:r>
-      <w:r>
-        <w:rPr>
-          <w:b w:val="0"/>
-          <w:bCs w:val="0"/>
-          <w:sz w:val="22"/>
-          <w:szCs w:val="22"/>
-          <w:highlight w:val="none"/>
           <w:lang w:val="pt-BR"/>
         </w:rPr>
       </w:r>
@@ -1501,7 +1107,7 @@
           <w:szCs w:val="22"/>
           <w:lang w:val="pt-BR"/>
         </w:rPr>
-        <w:t xml:space="preserve">, o(a) COMPRADOR(A) pagará ao(à) VENDEDOR(A) o valor total de R$ _________________ (_______________________________________________________).</w:t>
+        <w:t xml:space="preserve">, o(a) COMPRADOR(A) pagará ao(à) VENDEDOR(A) o valor total de R$ _________________ (____________________________________________________________________________).</w:t>
       </w:r>
       <w:r>
         <w:rPr>
@@ -1536,7 +1142,7 @@
           <w:szCs w:val="22"/>
           <w:lang w:val="pt-BR" w:bidi="pt-BR"/>
         </w:rPr>
-        <w:t xml:space="preserve">Havendo parcelamento, R$ _____________ a título de entrada/sinal, e o saldo remanescente de</w:t>
+        <w:t xml:space="preserve">Havendo parcelamento, R$ _____________ a título de entrada, e o saldo remanescente de</w:t>
       </w:r>
       <w:r>
         <w:rPr>
@@ -1566,7 +1172,7 @@
           <w:szCs w:val="22"/>
           <w:lang w:val="pt-BR" w:bidi="pt-BR"/>
         </w:rPr>
-        <w:t xml:space="preserve">primeira em $________________, e as demais no mesmo dia dos meses subsequentes.</w:t>
+        <w:t xml:space="preserve">primeira em ________________, e as demais no mesmo dia dos meses subsequentes.</w:t>
       </w:r>
       <w:r>
         <w:rPr>
@@ -1716,7 +1322,6 @@
           <w:szCs w:val="22"/>
           <w:lang w:val="pt-BR"/>
         </w:rPr>
-        <w:t xml:space="preserve">Com a assinatura deste instrumento e o pagamento integral do preço, </w:t>
       </w:r>
       <w:r>
         <w:rPr>
@@ -1724,7 +1329,7 @@
           <w:szCs w:val="22"/>
           <w:lang w:val="pt-BR"/>
         </w:rPr>
-        <w:t xml:space="preserve">ou na forma expressamente ajustada entre as partes</w:t>
+        <w:t xml:space="preserve">Com a assinatura deste instrumento e o pagamento integral do preço, ou na forma expressamente ajustada entre as partes, o(a) VENDEDOR(A) transfere ao(à) COMPRADOR(A) a posse do imóvel descrito na Cláusula Primeira, passando este(a) a exercer, em relação ao </w:t>
       </w:r>
       <w:r>
         <w:rPr>
@@ -1732,23 +1337,7 @@
           <w:szCs w:val="22"/>
           <w:lang w:val="pt-BR"/>
         </w:rPr>
-        <w:t xml:space="preserve"> o(a) VENDEDOR(A) transfere ao(à) COMPRADOR(A)</w:t>
-      </w:r>
-      <w:r>
-        <w:rPr>
-          <w:sz w:val="22"/>
-          <w:szCs w:val="22"/>
-          <w:lang w:val="pt-BR"/>
-        </w:rPr>
-        <w:t xml:space="preserve"> </w:t>
-      </w:r>
-      <w:r>
-        <w:rPr>
-          <w:sz w:val="22"/>
-          <w:szCs w:val="22"/>
-          <w:lang w:val="pt-BR"/>
-        </w:rPr>
-        <w:t xml:space="preserve">a posse do imóvel descrito na Cláusula Primeira. A partir da imissão na posse, o(a) COMPRADOR(A) poderá usar, ocupar, conservar e realizar benfeitorias no imóvel, observadas as limitações legais e administrativas aplicáveis.</w:t>
+        <w:t xml:space="preserve">imóvel, os poderes inerentes à posse, nos termos da legislação aplicável.</w:t>
       </w:r>
       <w:r>
         <w:rPr>
@@ -2002,7 +1591,15 @@
           <w:szCs w:val="22"/>
           <w:lang w:val="pt-BR"/>
         </w:rPr>
-        <w:t xml:space="preserve">O(A) VENDEDOR(A) obriga-se a apresentar ao(à) COMPRADOR(A) certidão atualizada da matrícula do imóvel, contendo a situação registral vigente na data da venda. O(A) COMPRADOR(A) declara ter ciência da situação constante da referida matrícula.</w:t>
+        <w:t xml:space="preserve">O(A) VENDEDOR(A) obriga-se a apresentar ao(à) COMPRADOR(A) certidão atualizada da matrícula do imóvel, contendo a situação registral vigente na data da venda. </w:t>
+      </w:r>
+      <w:r>
+        <w:rPr>
+          <w:sz w:val="22"/>
+          <w:szCs w:val="22"/>
+          <w:lang w:val="pt-BR"/>
+        </w:rPr>
+        <w:t xml:space="preserve">O(A) COMPRADOR(A) declara ter recebido e examinado a certidão atualizada da matrícula do imóvel.</w:t>
       </w:r>
       <w:r>
         <w:rPr>
@@ -2427,94 +2024,7 @@
           <w:szCs w:val="22"/>
           <w:lang w:val="pt-BR"/>
         </w:rPr>
-        <w:t xml:space="preserve">CLÁUSULA DÉCIMA SEGUNDA - DA SUCESSÃO</w:t>
-      </w:r>
-      <w:r>
-        <w:rPr>
-          <w:sz w:val="22"/>
-          <w:szCs w:val="22"/>
-          <w:lang w:val="pt-BR"/>
-        </w:rPr>
-      </w:r>
-      <w:r>
-        <w:rPr>
-          <w:sz w:val="22"/>
-          <w:szCs w:val="22"/>
-          <w:lang w:val="pt-BR"/>
-        </w:rPr>
-      </w:r>
-    </w:p>
-    <w:p>
-      <w:pPr>
-        <w:pBdr/>
-        <w:spacing w:line="276" w:lineRule="auto"/>
-        <w:ind w:left="-5"/>
-        <w:jc w:val="left"/>
-        <w:rPr>
-          <w:sz w:val="22"/>
-          <w:szCs w:val="22"/>
-          <w:lang w:val="pt-BR"/>
-        </w:rPr>
-      </w:pPr>
-      <w:r>
-        <w:rPr>
-          <w:sz w:val="22"/>
-          <w:szCs w:val="22"/>
-          <w:lang w:val="pt-BR"/>
-        </w:rPr>
-        <w:t xml:space="preserve">O presente contrato obriga as partes contratantes, bem como seus respectivos herdeiros e sucessores, a qualquer título, respeitados os limites dos </w:t>
-      </w:r>
-      <w:r>
-        <w:rPr>
-          <w:sz w:val="22"/>
-          <w:szCs w:val="22"/>
-          <w:lang w:val="pt-BR"/>
-        </w:rPr>
-        <w:t xml:space="preserve">direitos decorrentes deste contrato</w:t>
-      </w:r>
-      <w:r>
-        <w:rPr>
-          <w:sz w:val="22"/>
-          <w:szCs w:val="22"/>
-          <w:lang w:val="pt-BR"/>
-        </w:rPr>
-        <w:t xml:space="preserve"> neste instrumento.</w:t>
-      </w:r>
-      <w:r>
-        <w:rPr>
-          <w:sz w:val="22"/>
-          <w:szCs w:val="22"/>
-          <w:lang w:val="pt-BR"/>
-        </w:rPr>
-      </w:r>
-      <w:r>
-        <w:rPr>
-          <w:sz w:val="22"/>
-          <w:szCs w:val="22"/>
-          <w:lang w:val="pt-BR"/>
-        </w:rPr>
-      </w:r>
-    </w:p>
-    <w:p>
-      <w:pPr>
-        <w:pStyle w:val="838"/>
-        <w:pBdr/>
-        <w:spacing w:after="183" w:line="276" w:lineRule="auto"/>
-        <w:ind w:left="-5"/>
-        <w:jc w:val="left"/>
-        <w:rPr>
-          <w:sz w:val="22"/>
-          <w:szCs w:val="22"/>
-          <w:lang w:val="pt-BR"/>
-        </w:rPr>
-      </w:pPr>
-      <w:r>
-        <w:rPr>
-          <w:sz w:val="22"/>
-          <w:szCs w:val="22"/>
-          <w:lang w:val="pt-BR"/>
-        </w:rPr>
-        <w:t xml:space="preserve">CLÁUSULA DÉCIMA TERCEIRA - DO INADIMPLEMENTO</w:t>
+        <w:t xml:space="preserve">CLÁUSULA DÉCIMA SEGUNDA  - DO INADIMPLEMENTO</w:t>
       </w:r>
       <w:r>
         <w:rPr>
@@ -2593,7 +2103,7 @@
           <w:szCs w:val="22"/>
           <w:lang w:val="pt-BR"/>
         </w:rPr>
-        <w:t xml:space="preserve">CLÁUSULA DÉCIMA QUARTA - DO FORO</w:t>
+        <w:t xml:space="preserve">CLÁUSULA DÉCIMA TERCEIRA - DO FORO</w:t>
       </w:r>
       <w:r>
         <w:rPr>
@@ -2652,19 +2162,6 @@
           <w:lang w:val="pt-BR"/>
         </w:rPr>
       </w:r>
-    </w:p>
-    <w:p>
-      <w:pPr>
-        <w:pBdr/>
-        <w:spacing w:line="276" w:lineRule="auto"/>
-        <w:ind w:left="-5"/>
-        <w:jc w:val="left"/>
-        <w:rPr>
-          <w:sz w:val="22"/>
-          <w:szCs w:val="22"/>
-          <w:lang w:val="pt-BR"/>
-        </w:rPr>
-      </w:pPr>
       <w:r>
         <w:rPr>
           <w:sz w:val="22"/>
@@ -2672,237 +2169,6 @@
           <w:lang w:val="pt-BR"/>
         </w:rPr>
       </w:r>
-      <w:r>
-        <w:rPr>
-          <w:sz w:val="22"/>
-          <w:szCs w:val="22"/>
-          <w:lang w:val="pt-BR"/>
-        </w:rPr>
-      </w:r>
-      <w:r>
-        <w:rPr>
-          <w:sz w:val="22"/>
-          <w:szCs w:val="22"/>
-          <w:lang w:val="pt-BR"/>
-        </w:rPr>
-      </w:r>
-    </w:p>
-    <w:p>
-      <w:pPr>
-        <w:pBdr/>
-        <w:spacing w:line="276" w:lineRule="auto"/>
-        <w:ind w:left="-5"/>
-        <w:jc w:val="left"/>
-        <w:rPr>
-          <w:sz w:val="22"/>
-          <w:szCs w:val="22"/>
-          <w:lang w:val="pt-BR"/>
-        </w:rPr>
-      </w:pPr>
-      <w:r>
-        <w:rPr>
-          <w:sz w:val="22"/>
-          <w:szCs w:val="22"/>
-          <w:lang w:val="pt-BR"/>
-        </w:rPr>
-      </w:r>
-      <w:r>
-        <w:rPr>
-          <w:sz w:val="22"/>
-          <w:szCs w:val="22"/>
-          <w:lang w:val="pt-BR"/>
-        </w:rPr>
-      </w:r>
-      <w:r>
-        <w:rPr>
-          <w:sz w:val="22"/>
-          <w:szCs w:val="22"/>
-          <w:lang w:val="pt-BR"/>
-        </w:rPr>
-      </w:r>
-    </w:p>
-    <w:p>
-      <w:pPr>
-        <w:pBdr/>
-        <w:spacing w:line="276" w:lineRule="auto"/>
-        <w:ind w:left="-5"/>
-        <w:jc w:val="left"/>
-        <w:rPr>
-          <w:sz w:val="22"/>
-          <w:szCs w:val="22"/>
-          <w:lang w:val="pt-BR"/>
-        </w:rPr>
-      </w:pPr>
-      <w:r>
-        <w:rPr>
-          <w:sz w:val="22"/>
-          <w:szCs w:val="22"/>
-          <w:lang w:val="pt-BR"/>
-        </w:rPr>
-      </w:r>
-      <w:r>
-        <w:rPr>
-          <w:sz w:val="22"/>
-          <w:szCs w:val="22"/>
-          <w:lang w:val="pt-BR"/>
-        </w:rPr>
-      </w:r>
-      <w:r>
-        <w:rPr>
-          <w:sz w:val="22"/>
-          <w:szCs w:val="22"/>
-          <w:lang w:val="pt-BR"/>
-        </w:rPr>
-      </w:r>
-    </w:p>
-    <w:p>
-      <w:pPr>
-        <w:pBdr/>
-        <w:spacing w:line="276" w:lineRule="auto"/>
-        <w:ind w:left="-5"/>
-        <w:jc w:val="left"/>
-        <w:rPr>
-          <w:sz w:val="22"/>
-          <w:szCs w:val="22"/>
-          <w:lang w:val="pt-BR"/>
-        </w:rPr>
-      </w:pPr>
-      <w:r>
-        <w:rPr>
-          <w:sz w:val="22"/>
-          <w:szCs w:val="22"/>
-          <w:lang w:val="pt-BR"/>
-        </w:rPr>
-      </w:r>
-      <w:r>
-        <w:rPr>
-          <w:sz w:val="22"/>
-          <w:szCs w:val="22"/>
-          <w:lang w:val="pt-BR"/>
-        </w:rPr>
-      </w:r>
-      <w:r>
-        <w:rPr>
-          <w:sz w:val="22"/>
-          <w:szCs w:val="22"/>
-          <w:lang w:val="pt-BR"/>
-        </w:rPr>
-      </w:r>
-    </w:p>
-    <w:p>
-      <w:pPr>
-        <w:pBdr/>
-        <w:spacing w:line="276" w:lineRule="auto"/>
-        <w:ind w:left="-5"/>
-        <w:jc w:val="left"/>
-        <w:rPr>
-          <w:sz w:val="22"/>
-          <w:szCs w:val="22"/>
-          <w:lang w:val="pt-BR"/>
-        </w:rPr>
-      </w:pPr>
-      <w:r>
-        <w:rPr>
-          <w:sz w:val="22"/>
-          <w:szCs w:val="22"/>
-          <w:lang w:val="pt-BR"/>
-        </w:rPr>
-      </w:r>
-      <w:r>
-        <w:rPr>
-          <w:sz w:val="22"/>
-          <w:szCs w:val="22"/>
-          <w:lang w:val="pt-BR"/>
-        </w:rPr>
-      </w:r>
-      <w:r>
-        <w:rPr>
-          <w:sz w:val="22"/>
-          <w:szCs w:val="22"/>
-          <w:lang w:val="pt-BR"/>
-        </w:rPr>
-      </w:r>
-    </w:p>
-    <w:p>
-      <w:pPr>
-        <w:pBdr/>
-        <w:spacing w:line="276" w:lineRule="auto"/>
-        <w:ind w:left="-5"/>
-        <w:jc w:val="left"/>
-        <w:rPr>
-          <w:sz w:val="22"/>
-          <w:szCs w:val="22"/>
-          <w:lang w:val="pt-BR"/>
-        </w:rPr>
-      </w:pPr>
-      <w:r>
-        <w:rPr>
-          <w:sz w:val="22"/>
-          <w:szCs w:val="22"/>
-          <w:lang w:val="pt-BR"/>
-        </w:rPr>
-      </w:r>
-      <w:r>
-        <w:rPr>
-          <w:sz w:val="22"/>
-          <w:szCs w:val="22"/>
-          <w:lang w:val="pt-BR"/>
-        </w:rPr>
-      </w:r>
-      <w:r>
-        <w:rPr>
-          <w:sz w:val="22"/>
-          <w:szCs w:val="22"/>
-          <w:lang w:val="pt-BR"/>
-        </w:rPr>
-      </w:r>
-    </w:p>
-    <w:p>
-      <w:pPr>
-        <w:pBdr/>
-        <w:spacing w:line="276" w:lineRule="auto"/>
-        <w:ind w:firstLine="0" w:left="0"/>
-        <w:jc w:val="left"/>
-        <w:rPr>
-          <w:sz w:val="22"/>
-          <w:szCs w:val="22"/>
-          <w:lang w:val="pt-BR"/>
-        </w:rPr>
-      </w:pPr>
-      <w:r>
-        <w:rPr>
-          <w:sz w:val="22"/>
-          <w:szCs w:val="22"/>
-          <w:lang w:val="pt-BR"/>
-        </w:rPr>
-      </w:r>
-      <w:r>
-        <w:rPr>
-          <w:sz w:val="22"/>
-          <w:szCs w:val="22"/>
-          <w:lang w:val="pt-BR"/>
-        </w:rPr>
-      </w:r>
-      <w:r>
-        <w:rPr>
-          <w:sz w:val="22"/>
-          <w:szCs w:val="22"/>
-          <w:lang w:val="pt-BR"/>
-        </w:rPr>
-      </w:r>
-    </w:p>
-    <w:p>
-      <w:pPr>
-        <w:pBdr/>
-        <w:spacing w:line="276" w:lineRule="auto"/>
-        <w:ind w:firstLine="0" w:left="0"/>
-        <w:jc w:val="left"/>
-        <w:rPr>
-          <w:sz w:val="22"/>
-          <w:szCs w:val="22"/>
-          <w:lang w:val="pt-BR"/>
-        </w:rPr>
-      </w:pPr>
       <w:r>
         <w:rPr>
           <w:sz w:val="22"/>
@@ -3194,7 +2460,16 @@
         <w:tab/>
         <w:tab/>
         <w:tab/>
-        <w:t xml:space="preserve">CÔNJUGE DO(A) VENDEDOR(A)</w:t>
+      </w:r>
+      <w:r>
+        <w:rPr>
+          <w:b/>
+          <w:bCs/>
+          <w:sz w:val="18"/>
+          <w:szCs w:val="18"/>
+          <w:lang w:val="pt-BR"/>
+        </w:rPr>
+        <w:t xml:space="preserve">CÔNJUGE ANUENTE DO(A) VENDEDOR(A)</w:t>
       </w:r>
       <w:r>
         <w:rPr>
@@ -3525,39 +2800,6 @@
           <w:szCs w:val="18"/>
           <w:lang w:val="pt-BR"/>
         </w:rPr>
-        <w:tab/>
-      </w:r>
-      <w:r>
-        <w:rPr>
-          <w:b/>
-          <w:bCs/>
-          <w:sz w:val="18"/>
-          <w:szCs w:val="18"/>
-          <w:lang w:val="pt-BR"/>
-        </w:rPr>
-        <w:tab/>
-      </w:r>
-      <w:r>
-        <w:rPr>
-          <w:b/>
-          <w:bCs/>
-          <w:sz w:val="18"/>
-          <w:szCs w:val="18"/>
-          <w:lang w:val="pt-BR"/>
-        </w:rPr>
-        <w:tab/>
-        <w:tab/>
-        <w:tab/>
-        <w:t xml:space="preserve">CÔNJUGE DO(A) COMPRADOR(A)</w:t>
-      </w:r>
-      <w:r>
-        <w:rPr>
-          <w:b/>
-          <w:bCs/>
-          <w:sz w:val="18"/>
-          <w:szCs w:val="18"/>
-          <w:lang w:val="pt-BR"/>
-        </w:rPr>
       </w:r>
       <w:r>
         <w:rPr>
@@ -3603,8 +2845,6 @@
           <w:szCs w:val="22"/>
           <w:lang w:val="pt-BR"/>
         </w:rPr>
-        <w:tab/>
-        <w:t xml:space="preserve">___________________________________</w:t>
       </w:r>
       <w:r>
         <w:rPr>
@@ -3665,32 +2905,6 @@
           <w:szCs w:val="22"/>
           <w:lang w:val="pt-BR"/>
         </w:rPr>
-        <w:tab/>
-      </w:r>
-      <w:r>
-        <w:rPr>
-          <w:b/>
-          <w:bCs/>
-          <w:sz w:val="18"/>
-          <w:szCs w:val="18"/>
-          <w:lang w:val="pt-BR"/>
-        </w:rPr>
-        <w:t xml:space="preserve">Nome: </w:t>
-      </w:r>
-      <w:r>
-        <w:rPr>
-          <w:sz w:val="22"/>
-          <w:szCs w:val="22"/>
-          <w:lang w:val="pt-BR"/>
-        </w:rPr>
-        <w:t xml:space="preserve">______________________________</w:t>
-      </w:r>
-      <w:r>
-        <w:rPr>
-          <w:sz w:val="22"/>
-          <w:szCs w:val="22"/>
-          <w:lang w:val="pt-BR"/>
-        </w:rPr>
       </w:r>
       <w:r>
         <w:rPr>
@@ -3740,34 +2954,10 @@
       </w:r>
       <w:r>
         <w:rPr>
-          <w:sz w:val="22"/>
-          <w:szCs w:val="22"/>
-          <w:lang w:val="pt-BR"/>
-        </w:rPr>
-        <w:tab/>
-      </w:r>
-      <w:r>
-        <w:rPr>
           <w:b/>
           <w:bCs/>
           <w:sz w:val="18"/>
           <w:szCs w:val="18"/>
-          <w:lang w:val="pt-BR"/>
-        </w:rPr>
-        <w:t xml:space="preserve">CPF: </w:t>
-      </w:r>
-      <w:r>
-        <w:rPr>
-          <w:sz w:val="22"/>
-          <w:szCs w:val="22"/>
-          <w:lang w:val="pt-BR"/>
-        </w:rPr>
-        <w:t xml:space="preserve">_______________________________</w:t>
-      </w:r>
-      <w:r>
-        <w:rPr>
-          <w:sz w:val="22"/>
-          <w:szCs w:val="22"/>
           <w:lang w:val="pt-BR"/>
         </w:rPr>
       </w:r>

</xml_diff>

<commit_message>
Changed text seller data
</commit_message>
<xml_diff>
--- a/contract_files/models/Contrato Compra e Venda de Imovel com Matricula.docx
+++ b/contract_files/models/Contrato Compra e Venda de Imovel com Matricula.docx
@@ -127,7 +127,23 @@
           <w:szCs w:val="22"/>
           <w:lang w:val="pt-BR"/>
         </w:rPr>
-        <w:t xml:space="preserve">regime de bens: ________________________,</w:t>
+      </w:r>
+      <w:r>
+        <w:rPr>
+          <w:sz w:val="22"/>
+          <w:szCs w:val="22"/>
+          <w:lang w:val="pt-BR"/>
+        </w:rPr>
+        <w:t xml:space="preserve">sob o regime de: </w:t>
+      </w:r>
+      <w:r/>
+      <w:r>
+        <w:rPr>
+          <w:sz w:val="22"/>
+          <w:szCs w:val="22"/>
+          <w:lang w:val="pt-BR"/>
+        </w:rPr>
+        <w:t xml:space="preserve">________________________,</w:t>
       </w:r>
       <w:r>
         <w:rPr>
@@ -160,7 +176,13 @@
           <w:lang w:val="pt-BR"/>
         </w:rPr>
       </w:r>
-      <w:r/>
+      <w:r>
+        <w:rPr>
+          <w:sz w:val="22"/>
+          <w:szCs w:val="22"/>
+          <w:lang w:val="pt-BR"/>
+        </w:rPr>
+      </w:r>
     </w:p>
     <w:p>
       <w:pPr>
@@ -283,6 +305,13 @@
           <w:lang w:val="pt-BR"/>
         </w:rPr>
       </w:r>
+      <w:r>
+        <w:rPr>
+          <w:sz w:val="22"/>
+          <w:szCs w:val="22"/>
+          <w:lang w:val="pt-BR"/>
+        </w:rPr>
+      </w:r>
     </w:p>
     <w:p>
       <w:pPr>
@@ -326,6 +355,7 @@
         <w:rPr>
           <w:sz w:val="22"/>
           <w:szCs w:val="22"/>
+          <w:highlight w:val="none"/>
           <w:lang w:val="pt-BR"/>
         </w:rPr>
       </w:r>
@@ -397,6 +427,13 @@
           <w:lang w:val="pt-BR"/>
         </w:rPr>
       </w:r>
+      <w:r>
+        <w:rPr>
+          <w:sz w:val="22"/>
+          <w:szCs w:val="22"/>
+          <w:lang w:val="pt-BR"/>
+        </w:rPr>
+      </w:r>
     </w:p>
     <w:p>
       <w:pPr>
@@ -432,7 +469,13 @@
           <w:lang w:val="pt-BR"/>
         </w:rPr>
       </w:r>
-      <w:r/>
+      <w:r>
+        <w:rPr>
+          <w:sz w:val="22"/>
+          <w:szCs w:val="22"/>
+          <w:lang w:val="pt-BR"/>
+        </w:rPr>
+      </w:r>
     </w:p>
     <w:p>
       <w:pPr>

</xml_diff>

<commit_message>
Changed and cleaned text
</commit_message>
<xml_diff>
--- a/contract_files/models/Contrato Compra e Venda de Imovel com Matricula.docx
+++ b/contract_files/models/Contrato Compra e Venda de Imovel com Matricula.docx
@@ -127,16 +127,8 @@
           <w:szCs w:val="22"/>
           <w:lang w:val="pt-BR"/>
         </w:rPr>
-      </w:r>
-      <w:r>
-        <w:rPr>
-          <w:sz w:val="22"/>
-          <w:szCs w:val="22"/>
-          <w:lang w:val="pt-BR"/>
-        </w:rPr>
         <w:t xml:space="preserve">sob o regime de: </w:t>
       </w:r>
-      <w:r/>
       <w:r>
         <w:rPr>
           <w:sz w:val="22"/>
@@ -301,7 +293,6 @@
         <w:rPr>
           <w:sz w:val="22"/>
           <w:szCs w:val="22"/>
-          <w:highlight w:val="none"/>
           <w:lang w:val="pt-BR"/>
         </w:rPr>
       </w:r>
@@ -678,7 +669,13 @@
         <w:spacing w:line="276" w:lineRule="auto"/>
         <w:ind w:left="-5"/>
         <w:jc w:val="left"/>
-        <w:rPr/>
+        <w:rPr>
+          <w:b w:val="0"/>
+          <w:bCs w:val="0"/>
+          <w:sz w:val="22"/>
+          <w:szCs w:val="22"/>
+          <w:lang w:val="pt-BR"/>
+        </w:rPr>
       </w:pPr>
       <w:r>
         <w:rPr>
@@ -739,16 +736,6 @@
           <w:lang w:val="pt-BR"/>
         </w:rPr>
       </w:r>
-      <w:r/>
-    </w:p>
-    <w:p>
-      <w:pPr>
-        <w:pBdr/>
-        <w:spacing w:line="276" w:lineRule="auto"/>
-        <w:ind w:left="-5"/>
-        <w:jc w:val="left"/>
-        <w:rPr/>
-      </w:pPr>
       <w:r>
         <w:rPr>
           <w:b/>
@@ -789,15 +776,7 @@
         </w:rPr>
         <w:t xml:space="preserve"> aplicáveis ao imóvel.</w:t>
       </w:r>
-      <w:r>
-        <w:rPr>
-          <w:b w:val="0"/>
-          <w:bCs w:val="0"/>
-          <w:sz w:val="22"/>
-          <w:szCs w:val="22"/>
-          <w:lang w:val="pt-BR"/>
-        </w:rPr>
-      </w:r>
+      <w:r/>
       <w:r/>
     </w:p>
     <w:p>

</xml_diff>